<commit_message>
Sync acctest with main (v6.0.2), split acceptance tests by account
</commit_message>
<xml_diff>
--- a/OpenSourceNotice.docx
+++ b/OpenSourceNotice.docx
@@ -11,6 +11,8 @@
           <w:color w:val="0070C0"/>
         </w:rPr>
       </w:pPr>
+      <w:bookmarkStart w:id="0" w:name="_GoBack"/>
+      <w:bookmarkEnd w:id="0"/>
       <w:r>
         <w:rPr>
           <w:rFonts w:ascii="Verdana" w:hAnsi="Verdana"/>
@@ -51,7 +53,7 @@
           <w:rFonts w:ascii="Verdana" w:hAnsi="Verdana"/>
           <w:color w:val="0070C0"/>
         </w:rPr>
-        <w:t>5</w:t>
+        <w:t>9</w:t>
       </w:r>
       <w:r>
         <w:rPr>
@@ -115,18 +117,7 @@
           <w:sz w:val="24"/>
           <w:szCs w:val="24"/>
         </w:rPr>
-        <w:t xml:space="preserve">The following </w:t>
-      </w:r>
-      <w:bookmarkStart w:id="0" w:name="_GoBack"/>
-      <w:bookmarkEnd w:id="0"/>
-      <w:r>
-        <w:rPr>
-          <w:rFonts w:hint="eastAsia"/>
-          <w:b w:val="0"/>
-          <w:sz w:val="24"/>
-          <w:szCs w:val="24"/>
-        </w:rPr>
-        <w:t xml:space="preserve">sets forth attribution notices for third party software that may be contained in portions of this </w:t>
+        <w:t xml:space="preserve">The following sets forth attribution notices for third party software that may be contained in portions of this </w:t>
       </w:r>
       <w:r>
         <w:rPr>
@@ -419,7 +410,16 @@
                 <w:sz w:val="16"/>
                 <w:szCs w:val="16"/>
               </w:rPr>
-              <w:t>80</w:t>
+              <w:t>8</w:t>
+            </w:r>
+            <w:r>
+              <w:rPr>
+                <w:rFonts w:ascii="Verdana" w:hAnsi="Verdana"/>
+                <w:color w:val="000000"/>
+                <w:sz w:val="16"/>
+                <w:szCs w:val="16"/>
+              </w:rPr>
+              <w:t>3</w:t>
             </w:r>
             <w:r>
               <w:rPr>
@@ -437,7 +437,7 @@
                 <w:sz w:val="16"/>
                 <w:szCs w:val="16"/>
               </w:rPr>
-              <w:t>0</w:t>
+              <w:t>2</w:t>
             </w:r>
           </w:p>
           <w:p>
@@ -1921,7 +1921,16 @@
                 <w:sz w:val="16"/>
                 <w:szCs w:val="16"/>
               </w:rPr>
-              <w:t>50</w:t>
+              <w:t>5</w:t>
+            </w:r>
+            <w:r>
+              <w:rPr>
+                <w:rFonts w:ascii="Verdana" w:hAnsi="Verdana"/>
+                <w:color w:val="000000"/>
+                <w:sz w:val="16"/>
+                <w:szCs w:val="16"/>
+              </w:rPr>
+              <w:t>5</w:t>
             </w:r>
             <w:r>
               <w:rPr>
@@ -1976,7 +1985,7 @@
                 <w:sz w:val="16"/>
                 <w:szCs w:val="16"/>
               </w:rPr>
-              <w:t>golang protobuf</w:t>
+              <w:t>Golang Protobuf</w:t>
             </w:r>
             <w:r>
               <w:rPr>
@@ -2003,6 +2012,189 @@
                 <w:sz w:val="16"/>
                 <w:szCs w:val="16"/>
               </w:rPr>
+              <w:t>4</w:t>
+            </w:r>
+            <w:r>
+              <w:rPr>
+                <w:rFonts w:ascii="Verdana" w:hAnsi="Verdana"/>
+                <w:color w:val="000000"/>
+                <w:sz w:val="16"/>
+                <w:szCs w:val="16"/>
+              </w:rPr>
+              <w:t xml:space="preserve"> : </w:t>
+            </w:r>
+            <w:r>
+              <w:rPr>
+                <w:rFonts w:ascii="Verdana" w:hAnsi="Verdana"/>
+                <w:color w:val="000000"/>
+                <w:sz w:val="16"/>
+                <w:szCs w:val="16"/>
+              </w:rPr>
+              <w:t>Copyright 2010 The Go Authors.  All rights reserved.</w:t>
+            </w:r>
+          </w:p>
+          <w:p>
+            <w:pPr>
+              <w:rPr>
+                <w:rFonts w:ascii="Verdana" w:hAnsi="Verdana"/>
+                <w:color w:val="000000"/>
+                <w:sz w:val="16"/>
+                <w:szCs w:val="16"/>
+              </w:rPr>
+            </w:pPr>
+            <w:r>
+              <w:rPr>
+                <w:rFonts w:ascii="Verdana" w:hAnsi="Verdana"/>
+                <w:color w:val="000000"/>
+                <w:sz w:val="16"/>
+                <w:szCs w:val="16"/>
+              </w:rPr>
+              <w:t xml:space="preserve">golang.org/x/mod </w:t>
+            </w:r>
+            <w:r>
+              <w:rPr>
+                <w:rFonts w:ascii="Verdana" w:hAnsi="Verdana"/>
+                <w:color w:val="000000"/>
+                <w:sz w:val="16"/>
+                <w:szCs w:val="16"/>
+              </w:rPr>
+              <w:t>v</w:t>
+            </w:r>
+            <w:r>
+              <w:rPr>
+                <w:rFonts w:ascii="Verdana" w:hAnsi="Verdana"/>
+                <w:color w:val="000000"/>
+                <w:sz w:val="16"/>
+                <w:szCs w:val="16"/>
+              </w:rPr>
+              <w:t>0.</w:t>
+            </w:r>
+            <w:r>
+              <w:rPr>
+                <w:rFonts w:ascii="Verdana" w:hAnsi="Verdana"/>
+                <w:color w:val="000000"/>
+                <w:sz w:val="16"/>
+                <w:szCs w:val="16"/>
+              </w:rPr>
+              <w:t>3</w:t>
+            </w:r>
+            <w:r>
+              <w:rPr>
+                <w:rFonts w:ascii="Verdana" w:hAnsi="Verdana"/>
+                <w:color w:val="000000"/>
+                <w:sz w:val="16"/>
+                <w:szCs w:val="16"/>
+              </w:rPr>
+              <w:t>8</w:t>
+            </w:r>
+            <w:r>
+              <w:rPr>
+                <w:rFonts w:ascii="Verdana" w:hAnsi="Verdana"/>
+                <w:color w:val="000000"/>
+                <w:sz w:val="16"/>
+                <w:szCs w:val="16"/>
+              </w:rPr>
+              <w:t>.0  : Copyright (c) 2009 The Go Authors. All rights reserved.</w:t>
+            </w:r>
+          </w:p>
+          <w:p>
+            <w:pPr>
+              <w:rPr>
+                <w:rFonts w:ascii="Verdana" w:hAnsi="Verdana"/>
+                <w:color w:val="000000"/>
+                <w:sz w:val="16"/>
+                <w:szCs w:val="16"/>
+              </w:rPr>
+            </w:pPr>
+            <w:r>
+              <w:rPr>
+                <w:rFonts w:ascii="Verdana" w:hAnsi="Verdana"/>
+                <w:color w:val="000000"/>
+                <w:sz w:val="16"/>
+                <w:szCs w:val="16"/>
+              </w:rPr>
+              <w:t xml:space="preserve">golang.org/x/sys </w:t>
+            </w:r>
+            <w:r>
+              <w:rPr>
+                <w:rFonts w:ascii="Verdana" w:hAnsi="Verdana"/>
+                <w:color w:val="000000"/>
+                <w:sz w:val="16"/>
+                <w:szCs w:val="16"/>
+              </w:rPr>
+              <w:t>v</w:t>
+            </w:r>
+            <w:r>
+              <w:rPr>
+                <w:rFonts w:ascii="Verdana" w:hAnsi="Verdana"/>
+                <w:color w:val="000000"/>
+                <w:sz w:val="16"/>
+                <w:szCs w:val="16"/>
+              </w:rPr>
+              <w:t>0.</w:t>
+            </w:r>
+            <w:r>
+              <w:rPr>
+                <w:rFonts w:ascii="Verdana" w:hAnsi="Verdana"/>
+                <w:color w:val="000000"/>
+                <w:sz w:val="16"/>
+                <w:szCs w:val="16"/>
+              </w:rPr>
+              <w:t>4</w:t>
+            </w:r>
+            <w:r>
+              <w:rPr>
+                <w:rFonts w:ascii="Verdana" w:hAnsi="Verdana"/>
+                <w:color w:val="000000"/>
+                <w:sz w:val="16"/>
+                <w:szCs w:val="16"/>
+              </w:rPr>
+              <w:t>7</w:t>
+            </w:r>
+            <w:r>
+              <w:rPr>
+                <w:rFonts w:ascii="Verdana" w:hAnsi="Verdana"/>
+                <w:color w:val="000000"/>
+                <w:sz w:val="16"/>
+                <w:szCs w:val="16"/>
+              </w:rPr>
+              <w:t>.0  : Copyright (c) 2009 The Go Authors. All rights reserved.</w:t>
+            </w:r>
+          </w:p>
+          <w:p>
+            <w:pPr>
+              <w:rPr>
+                <w:rFonts w:ascii="Verdana" w:hAnsi="Verdana"/>
+                <w:color w:val="000000"/>
+                <w:sz w:val="16"/>
+                <w:szCs w:val="16"/>
+              </w:rPr>
+            </w:pPr>
+            <w:r>
+              <w:rPr>
+                <w:rFonts w:ascii="Verdana" w:hAnsi="Verdana"/>
+                <w:color w:val="000000"/>
+                <w:sz w:val="16"/>
+                <w:szCs w:val="16"/>
+              </w:rPr>
+              <w:t>golang/sync</w:t>
+            </w:r>
+            <w:r>
+              <w:rPr>
+                <w:rFonts w:ascii="Verdana" w:hAnsi="Verdana"/>
+                <w:color w:val="000000"/>
+                <w:sz w:val="16"/>
+                <w:szCs w:val="16"/>
+              </w:rPr>
+              <w:t xml:space="preserve"> v.0.</w:t>
+            </w:r>
+            <w:r>
+              <w:rPr>
+                <w:rFonts w:ascii="Verdana" w:hAnsi="Verdana"/>
+                <w:color w:val="000000"/>
+                <w:sz w:val="16"/>
+                <w:szCs w:val="16"/>
+              </w:rPr>
               <w:t>2</w:t>
             </w:r>
             <w:r>
@@ -2012,163 +2204,7 @@
                 <w:sz w:val="16"/>
                 <w:szCs w:val="16"/>
               </w:rPr>
-              <w:t xml:space="preserve"> : </w:t>
-            </w:r>
-            <w:r>
-              <w:rPr>
-                <w:rFonts w:ascii="Verdana" w:hAnsi="Verdana"/>
-                <w:color w:val="000000"/>
-                <w:sz w:val="16"/>
-                <w:szCs w:val="16"/>
-              </w:rPr>
-              <w:t>Copyright 2010 The Go Authors.  All rights reserved.</w:t>
-            </w:r>
-          </w:p>
-          <w:p>
-            <w:pPr>
-              <w:rPr>
-                <w:rFonts w:ascii="Verdana" w:hAnsi="Verdana"/>
-                <w:color w:val="000000"/>
-                <w:sz w:val="16"/>
-                <w:szCs w:val="16"/>
-              </w:rPr>
-            </w:pPr>
-            <w:r>
-              <w:rPr>
-                <w:rFonts w:ascii="Verdana" w:hAnsi="Verdana"/>
-                <w:color w:val="000000"/>
-                <w:sz w:val="16"/>
-                <w:szCs w:val="16"/>
-              </w:rPr>
-              <w:t xml:space="preserve">golang.org/x/mod </w:t>
-            </w:r>
-            <w:r>
-              <w:rPr>
-                <w:rFonts w:ascii="Verdana" w:hAnsi="Verdana"/>
-                <w:color w:val="000000"/>
-                <w:sz w:val="16"/>
-                <w:szCs w:val="16"/>
-              </w:rPr>
-              <w:t>v</w:t>
-            </w:r>
-            <w:r>
-              <w:rPr>
-                <w:rFonts w:ascii="Verdana" w:hAnsi="Verdana"/>
-                <w:color w:val="000000"/>
-                <w:sz w:val="16"/>
-                <w:szCs w:val="16"/>
-              </w:rPr>
-              <w:t>0.</w:t>
-            </w:r>
-            <w:r>
-              <w:rPr>
-                <w:rFonts w:ascii="Verdana" w:hAnsi="Verdana"/>
-                <w:color w:val="000000"/>
-                <w:sz w:val="16"/>
-                <w:szCs w:val="16"/>
-              </w:rPr>
-              <w:t>34</w:t>
-            </w:r>
-            <w:r>
-              <w:rPr>
-                <w:rFonts w:ascii="Verdana" w:hAnsi="Verdana"/>
-                <w:color w:val="000000"/>
-                <w:sz w:val="16"/>
-                <w:szCs w:val="16"/>
-              </w:rPr>
-              <w:t>.0  : Copyright (c) 2009 The Go Authors. All rights reserved.</w:t>
-            </w:r>
-          </w:p>
-          <w:p>
-            <w:pPr>
-              <w:rPr>
-                <w:rFonts w:ascii="Verdana" w:hAnsi="Verdana"/>
-                <w:color w:val="000000"/>
-                <w:sz w:val="16"/>
-                <w:szCs w:val="16"/>
-              </w:rPr>
-            </w:pPr>
-            <w:r>
-              <w:rPr>
-                <w:rFonts w:ascii="Verdana" w:hAnsi="Verdana"/>
-                <w:color w:val="000000"/>
-                <w:sz w:val="16"/>
-                <w:szCs w:val="16"/>
-              </w:rPr>
-              <w:t xml:space="preserve">golang.org/x/sys </w:t>
-            </w:r>
-            <w:r>
-              <w:rPr>
-                <w:rFonts w:ascii="Verdana" w:hAnsi="Verdana"/>
-                <w:color w:val="000000"/>
-                <w:sz w:val="16"/>
-                <w:szCs w:val="16"/>
-              </w:rPr>
-              <w:t>v</w:t>
-            </w:r>
-            <w:r>
-              <w:rPr>
-                <w:rFonts w:ascii="Verdana" w:hAnsi="Verdana"/>
-                <w:color w:val="000000"/>
-                <w:sz w:val="16"/>
-                <w:szCs w:val="16"/>
-              </w:rPr>
-              <w:t>0.</w:t>
-            </w:r>
-            <w:r>
-              <w:rPr>
-                <w:rFonts w:ascii="Verdana" w:hAnsi="Verdana"/>
-                <w:color w:val="000000"/>
-                <w:sz w:val="16"/>
-                <w:szCs w:val="16"/>
-              </w:rPr>
-              <w:t>43</w:t>
-            </w:r>
-            <w:r>
-              <w:rPr>
-                <w:rFonts w:ascii="Verdana" w:hAnsi="Verdana"/>
-                <w:color w:val="000000"/>
-                <w:sz w:val="16"/>
-                <w:szCs w:val="16"/>
-              </w:rPr>
-              <w:t>.0  : Copyright (c) 2009 The Go Authors. All rights reserved.</w:t>
-            </w:r>
-          </w:p>
-          <w:p>
-            <w:pPr>
-              <w:rPr>
-                <w:rFonts w:ascii="Verdana" w:hAnsi="Verdana"/>
-                <w:color w:val="000000"/>
-                <w:sz w:val="16"/>
-                <w:szCs w:val="16"/>
-              </w:rPr>
-            </w:pPr>
-            <w:r>
-              <w:rPr>
-                <w:rFonts w:ascii="Verdana" w:hAnsi="Verdana"/>
-                <w:color w:val="000000"/>
-                <w:sz w:val="16"/>
-                <w:szCs w:val="16"/>
-              </w:rPr>
-              <w:t>golang/sync</w:t>
-            </w:r>
-            <w:r>
-              <w:rPr>
-                <w:rFonts w:ascii="Verdana" w:hAnsi="Verdana"/>
-                <w:color w:val="000000"/>
-                <w:sz w:val="16"/>
-                <w:szCs w:val="16"/>
-              </w:rPr>
-              <w:t xml:space="preserve"> v.0.</w:t>
-            </w:r>
-            <w:r>
-              <w:rPr>
-                <w:rFonts w:ascii="Verdana" w:hAnsi="Verdana"/>
-                <w:color w:val="000000"/>
-                <w:sz w:val="16"/>
-                <w:szCs w:val="16"/>
-              </w:rPr>
-              <w:t>20</w:t>
+              <w:t>2</w:t>
             </w:r>
             <w:r>
               <w:rPr>
@@ -2215,7 +2251,218 @@
                 <w:sz w:val="16"/>
                 <w:szCs w:val="16"/>
               </w:rPr>
-              <w:t>3</w:t>
+              <w:t>41.</w:t>
+            </w:r>
+            <w:r>
+              <w:rPr>
+                <w:rFonts w:ascii="Verdana" w:hAnsi="Verdana"/>
+                <w:color w:val="000000"/>
+                <w:sz w:val="16"/>
+                <w:szCs w:val="16"/>
+              </w:rPr>
+              <w:t>0  : Copyright (c) 2009 The Go Authors. All rights reserved.</w:t>
+            </w:r>
+          </w:p>
+          <w:p>
+            <w:pPr>
+              <w:rPr>
+                <w:rFonts w:ascii="Verdana" w:hAnsi="Verdana"/>
+                <w:color w:val="000000"/>
+                <w:sz w:val="16"/>
+                <w:szCs w:val="16"/>
+              </w:rPr>
+            </w:pPr>
+            <w:r>
+              <w:rPr>
+                <w:rFonts w:ascii="Verdana" w:hAnsi="Verdana"/>
+                <w:color w:val="000000"/>
+                <w:sz w:val="16"/>
+                <w:szCs w:val="16"/>
+              </w:rPr>
+              <w:t>google/go-cmp v0.</w:t>
+            </w:r>
+            <w:r>
+              <w:rPr>
+                <w:rFonts w:ascii="Verdana" w:hAnsi="Verdana"/>
+                <w:color w:val="000000"/>
+                <w:sz w:val="16"/>
+                <w:szCs w:val="16"/>
+              </w:rPr>
+              <w:t>7</w:t>
+            </w:r>
+            <w:r>
+              <w:rPr>
+                <w:rFonts w:ascii="Verdana" w:hAnsi="Verdana"/>
+                <w:color w:val="000000"/>
+                <w:sz w:val="16"/>
+                <w:szCs w:val="16"/>
+              </w:rPr>
+              <w:t>.</w:t>
+            </w:r>
+            <w:r>
+              <w:rPr>
+                <w:rFonts w:ascii="Verdana" w:hAnsi="Verdana"/>
+                <w:color w:val="000000"/>
+                <w:sz w:val="16"/>
+                <w:szCs w:val="16"/>
+              </w:rPr>
+              <w:t>0</w:t>
+            </w:r>
+            <w:r>
+              <w:rPr>
+                <w:rFonts w:ascii="Verdana" w:hAnsi="Verdana"/>
+                <w:color w:val="000000"/>
+                <w:sz w:val="16"/>
+                <w:szCs w:val="16"/>
+              </w:rPr>
+              <w:t xml:space="preserve">  : Copyright (c) 2017 The Go Authors. All rights reserved.</w:t>
+            </w:r>
+          </w:p>
+          <w:p>
+            <w:pPr>
+              <w:rPr>
+                <w:rFonts w:ascii="Verdana" w:hAnsi="Verdana"/>
+                <w:color w:val="000000"/>
+                <w:sz w:val="16"/>
+                <w:szCs w:val="16"/>
+              </w:rPr>
+            </w:pPr>
+            <w:r>
+              <w:rPr>
+                <w:rFonts w:ascii="Verdana" w:hAnsi="Verdana"/>
+                <w:color w:val="000000"/>
+                <w:sz w:val="16"/>
+                <w:szCs w:val="16"/>
+              </w:rPr>
+              <w:t>net (github.com/golang/net) v0.</w:t>
+            </w:r>
+            <w:r>
+              <w:rPr>
+                <w:rFonts w:ascii="Verdana" w:hAnsi="Verdana"/>
+                <w:color w:val="000000"/>
+                <w:sz w:val="16"/>
+                <w:szCs w:val="16"/>
+              </w:rPr>
+              <w:t>5</w:t>
+            </w:r>
+            <w:r>
+              <w:rPr>
+                <w:rFonts w:ascii="Verdana" w:hAnsi="Verdana"/>
+                <w:color w:val="000000"/>
+                <w:sz w:val="16"/>
+                <w:szCs w:val="16"/>
+              </w:rPr>
+              <w:t>8</w:t>
+            </w:r>
+            <w:r>
+              <w:rPr>
+                <w:rFonts w:ascii="Verdana" w:hAnsi="Verdana"/>
+                <w:color w:val="000000"/>
+                <w:sz w:val="16"/>
+                <w:szCs w:val="16"/>
+              </w:rPr>
+              <w:t>.0  : Copyright (c) 2009 The Go Authors. All rights reserved.</w:t>
+            </w:r>
+          </w:p>
+          <w:p>
+            <w:pPr>
+              <w:rPr>
+                <w:rFonts w:ascii="Verdana" w:hAnsi="Verdana"/>
+                <w:color w:val="000000"/>
+                <w:sz w:val="16"/>
+                <w:szCs w:val="16"/>
+              </w:rPr>
+            </w:pPr>
+            <w:r>
+              <w:rPr>
+                <w:rFonts w:ascii="Verdana" w:hAnsi="Verdana"/>
+                <w:color w:val="000000"/>
+                <w:sz w:val="16"/>
+                <w:szCs w:val="16"/>
+              </w:rPr>
+              <w:t>protoc</w:t>
+            </w:r>
+            <w:r>
+              <w:rPr>
+                <w:rFonts w:ascii="Verdana" w:hAnsi="Verdana"/>
+                <w:color w:val="000000"/>
+                <w:sz w:val="16"/>
+                <w:szCs w:val="16"/>
+              </w:rPr>
+              <w:t>olbuffers/protobuf-go 1.</w:t>
+            </w:r>
+            <w:r>
+              <w:rPr>
+                <w:rFonts w:ascii="Verdana" w:hAnsi="Verdana"/>
+                <w:color w:val="000000"/>
+                <w:sz w:val="16"/>
+                <w:szCs w:val="16"/>
+              </w:rPr>
+              <w:t>36</w:t>
+            </w:r>
+            <w:r>
+              <w:rPr>
+                <w:rFonts w:ascii="Verdana" w:hAnsi="Verdana"/>
+                <w:color w:val="000000"/>
+                <w:sz w:val="16"/>
+                <w:szCs w:val="16"/>
+              </w:rPr>
+              <w:t>.</w:t>
+            </w:r>
+            <w:r>
+              <w:rPr>
+                <w:rFonts w:ascii="Verdana" w:hAnsi="Verdana"/>
+                <w:color w:val="000000"/>
+                <w:sz w:val="16"/>
+                <w:szCs w:val="16"/>
+              </w:rPr>
+              <w:t>11</w:t>
+            </w:r>
+            <w:r>
+              <w:rPr>
+                <w:rFonts w:ascii="Verdana" w:hAnsi="Verdana"/>
+                <w:color w:val="000000"/>
+                <w:sz w:val="16"/>
+                <w:szCs w:val="16"/>
+              </w:rPr>
+              <w:t xml:space="preserve">  : Copyright (c) 2018 The Go Authors. All rights reserved.</w:t>
+            </w:r>
+          </w:p>
+          <w:p>
+            <w:pPr>
+              <w:rPr>
+                <w:rFonts w:ascii="Verdana" w:hAnsi="Verdana"/>
+                <w:color w:val="000000"/>
+                <w:sz w:val="16"/>
+                <w:szCs w:val="16"/>
+              </w:rPr>
+            </w:pPr>
+            <w:r>
+              <w:rPr>
+                <w:rFonts w:ascii="Verdana" w:hAnsi="Verdana"/>
+                <w:color w:val="000000"/>
+                <w:sz w:val="16"/>
+                <w:szCs w:val="16"/>
+              </w:rPr>
+              <w:t>ProtonMail/go-crypto</w:t>
+            </w:r>
+            <w:r>
+              <w:rPr>
+                <w:rFonts w:ascii="Verdana" w:hAnsi="Verdana"/>
+                <w:color w:val="000000"/>
+                <w:sz w:val="16"/>
+                <w:szCs w:val="16"/>
+              </w:rPr>
+              <w:t xml:space="preserve"> </w:t>
+            </w:r>
+            <w:r>
+              <w:rPr>
+                <w:rFonts w:ascii="Verdana" w:hAnsi="Verdana"/>
+                <w:color w:val="000000"/>
+                <w:sz w:val="16"/>
+                <w:szCs w:val="16"/>
+              </w:rPr>
+              <w:t>v1.1.</w:t>
             </w:r>
             <w:r>
               <w:rPr>
@@ -2233,26 +2480,35 @@
                 <w:sz w:val="16"/>
                 <w:szCs w:val="16"/>
               </w:rPr>
-              <w:t>.0  : Copyright (c) 2009 The Go Authors. All rights reserved.</w:t>
-            </w:r>
-          </w:p>
-          <w:p>
-            <w:pPr>
-              <w:rPr>
-                <w:rFonts w:ascii="Verdana" w:hAnsi="Verdana"/>
-                <w:color w:val="000000"/>
-                <w:sz w:val="16"/>
-                <w:szCs w:val="16"/>
-              </w:rPr>
-            </w:pPr>
-            <w:r>
-              <w:rPr>
-                <w:rFonts w:ascii="Verdana" w:hAnsi="Verdana"/>
-                <w:color w:val="000000"/>
-                <w:sz w:val="16"/>
-                <w:szCs w:val="16"/>
-              </w:rPr>
-              <w:t>google/go-cmp v0.</w:t>
+              <w:t xml:space="preserve"> : </w:t>
+            </w:r>
+            <w:r>
+              <w:rPr>
+                <w:rFonts w:ascii="Verdana" w:hAnsi="Verdana"/>
+                <w:color w:val="000000"/>
+                <w:sz w:val="16"/>
+                <w:szCs w:val="16"/>
+              </w:rPr>
+              <w:t>Copyright (c) 2009 The Go Authors. All rights reserved.</w:t>
+            </w:r>
+          </w:p>
+          <w:p>
+            <w:pPr>
+              <w:rPr>
+                <w:rFonts w:ascii="Verdana" w:hAnsi="Verdana"/>
+                <w:color w:val="000000"/>
+                <w:sz w:val="16"/>
+                <w:szCs w:val="16"/>
+              </w:rPr>
+            </w:pPr>
+            <w:r>
+              <w:rPr>
+                <w:rFonts w:ascii="Verdana" w:hAnsi="Verdana"/>
+                <w:color w:val="000000"/>
+                <w:sz w:val="16"/>
+                <w:szCs w:val="16"/>
+              </w:rPr>
+              <w:t>spf13-pflag v1.0.</w:t>
             </w:r>
             <w:r>
               <w:rPr>
@@ -2270,226 +2526,6 @@
                 <w:sz w:val="16"/>
                 <w:szCs w:val="16"/>
               </w:rPr>
-              <w:t>.</w:t>
-            </w:r>
-            <w:r>
-              <w:rPr>
-                <w:rFonts w:ascii="Verdana" w:hAnsi="Verdana"/>
-                <w:color w:val="000000"/>
-                <w:sz w:val="16"/>
-                <w:szCs w:val="16"/>
-              </w:rPr>
-              <w:t>0</w:t>
-            </w:r>
-            <w:r>
-              <w:rPr>
-                <w:rFonts w:ascii="Verdana" w:hAnsi="Verdana"/>
-                <w:color w:val="000000"/>
-                <w:sz w:val="16"/>
-                <w:szCs w:val="16"/>
-              </w:rPr>
-              <w:t xml:space="preserve">  : Copyright (c) 2017 The Go Authors. All rights reserved.</w:t>
-            </w:r>
-          </w:p>
-          <w:p>
-            <w:pPr>
-              <w:rPr>
-                <w:rFonts w:ascii="Verdana" w:hAnsi="Verdana"/>
-                <w:color w:val="000000"/>
-                <w:sz w:val="16"/>
-                <w:szCs w:val="16"/>
-              </w:rPr>
-            </w:pPr>
-            <w:r>
-              <w:rPr>
-                <w:rFonts w:ascii="Verdana" w:hAnsi="Verdana"/>
-                <w:color w:val="000000"/>
-                <w:sz w:val="16"/>
-                <w:szCs w:val="16"/>
-              </w:rPr>
-              <w:t>net (github.com/golang/net) v0.</w:t>
-            </w:r>
-            <w:r>
-              <w:rPr>
-                <w:rFonts w:ascii="Verdana" w:hAnsi="Verdana"/>
-                <w:color w:val="000000"/>
-                <w:sz w:val="16"/>
-                <w:szCs w:val="16"/>
-              </w:rPr>
-              <w:t>53</w:t>
-            </w:r>
-            <w:r>
-              <w:rPr>
-                <w:rFonts w:ascii="Verdana" w:hAnsi="Verdana"/>
-                <w:color w:val="000000"/>
-                <w:sz w:val="16"/>
-                <w:szCs w:val="16"/>
-              </w:rPr>
-              <w:t>.0  : Copyright (c) 2009 The Go Authors. All rights reserved.</w:t>
-            </w:r>
-          </w:p>
-          <w:p>
-            <w:pPr>
-              <w:rPr>
-                <w:rFonts w:ascii="Verdana" w:hAnsi="Verdana"/>
-                <w:color w:val="000000"/>
-                <w:sz w:val="16"/>
-                <w:szCs w:val="16"/>
-              </w:rPr>
-            </w:pPr>
-            <w:r>
-              <w:rPr>
-                <w:rFonts w:ascii="Verdana" w:hAnsi="Verdana"/>
-                <w:color w:val="000000"/>
-                <w:sz w:val="16"/>
-                <w:szCs w:val="16"/>
-              </w:rPr>
-              <w:t>protoc</w:t>
-            </w:r>
-            <w:r>
-              <w:rPr>
-                <w:rFonts w:ascii="Verdana" w:hAnsi="Verdana"/>
-                <w:color w:val="000000"/>
-                <w:sz w:val="16"/>
-                <w:szCs w:val="16"/>
-              </w:rPr>
-              <w:t>olbuffers/protobuf-go 1.</w:t>
-            </w:r>
-            <w:r>
-              <w:rPr>
-                <w:rFonts w:ascii="Verdana" w:hAnsi="Verdana"/>
-                <w:color w:val="000000"/>
-                <w:sz w:val="16"/>
-                <w:szCs w:val="16"/>
-              </w:rPr>
-              <w:t>36</w:t>
-            </w:r>
-            <w:r>
-              <w:rPr>
-                <w:rFonts w:ascii="Verdana" w:hAnsi="Verdana"/>
-                <w:color w:val="000000"/>
-                <w:sz w:val="16"/>
-                <w:szCs w:val="16"/>
-              </w:rPr>
-              <w:t>.</w:t>
-            </w:r>
-            <w:r>
-              <w:rPr>
-                <w:rFonts w:ascii="Verdana" w:hAnsi="Verdana"/>
-                <w:color w:val="000000"/>
-                <w:sz w:val="16"/>
-                <w:szCs w:val="16"/>
-              </w:rPr>
-              <w:t>11</w:t>
-            </w:r>
-            <w:r>
-              <w:rPr>
-                <w:rFonts w:ascii="Verdana" w:hAnsi="Verdana"/>
-                <w:color w:val="000000"/>
-                <w:sz w:val="16"/>
-                <w:szCs w:val="16"/>
-              </w:rPr>
-              <w:t xml:space="preserve">  : Copyright (c) 2018 The Go Authors. All rights reserved.</w:t>
-            </w:r>
-          </w:p>
-          <w:p>
-            <w:pPr>
-              <w:rPr>
-                <w:rFonts w:ascii="Verdana" w:hAnsi="Verdana"/>
-                <w:color w:val="000000"/>
-                <w:sz w:val="16"/>
-                <w:szCs w:val="16"/>
-              </w:rPr>
-            </w:pPr>
-            <w:r>
-              <w:rPr>
-                <w:rFonts w:ascii="Verdana" w:hAnsi="Verdana"/>
-                <w:color w:val="000000"/>
-                <w:sz w:val="16"/>
-                <w:szCs w:val="16"/>
-              </w:rPr>
-              <w:t>ProtonMail/go-crypto</w:t>
-            </w:r>
-            <w:r>
-              <w:rPr>
-                <w:rFonts w:ascii="Verdana" w:hAnsi="Verdana"/>
-                <w:color w:val="000000"/>
-                <w:sz w:val="16"/>
-                <w:szCs w:val="16"/>
-              </w:rPr>
-              <w:t xml:space="preserve"> </w:t>
-            </w:r>
-            <w:r>
-              <w:rPr>
-                <w:rFonts w:ascii="Verdana" w:hAnsi="Verdana"/>
-                <w:color w:val="000000"/>
-                <w:sz w:val="16"/>
-                <w:szCs w:val="16"/>
-              </w:rPr>
-              <w:t>v1.1.</w:t>
-            </w:r>
-            <w:r>
-              <w:rPr>
-                <w:rFonts w:ascii="Verdana" w:hAnsi="Verdana"/>
-                <w:color w:val="000000"/>
-                <w:sz w:val="16"/>
-                <w:szCs w:val="16"/>
-              </w:rPr>
-              <w:t>6</w:t>
-            </w:r>
-            <w:r>
-              <w:rPr>
-                <w:rFonts w:ascii="Verdana" w:hAnsi="Verdana"/>
-                <w:color w:val="000000"/>
-                <w:sz w:val="16"/>
-                <w:szCs w:val="16"/>
-              </w:rPr>
-              <w:t xml:space="preserve"> : </w:t>
-            </w:r>
-            <w:r>
-              <w:rPr>
-                <w:rFonts w:ascii="Verdana" w:hAnsi="Verdana"/>
-                <w:color w:val="000000"/>
-                <w:sz w:val="16"/>
-                <w:szCs w:val="16"/>
-              </w:rPr>
-              <w:t>Copyright (c) 2009 The Go Authors. All rights reserved.</w:t>
-            </w:r>
-          </w:p>
-          <w:p>
-            <w:pPr>
-              <w:rPr>
-                <w:rFonts w:ascii="Verdana" w:hAnsi="Verdana"/>
-                <w:color w:val="000000"/>
-                <w:sz w:val="16"/>
-                <w:szCs w:val="16"/>
-              </w:rPr>
-            </w:pPr>
-            <w:r>
-              <w:rPr>
-                <w:rFonts w:ascii="Verdana" w:hAnsi="Verdana"/>
-                <w:color w:val="000000"/>
-                <w:sz w:val="16"/>
-                <w:szCs w:val="16"/>
-              </w:rPr>
-              <w:t>spf13-pflag v1.0.</w:t>
-            </w:r>
-            <w:r>
-              <w:rPr>
-                <w:rFonts w:ascii="Verdana" w:hAnsi="Verdana"/>
-                <w:color w:val="000000"/>
-                <w:sz w:val="16"/>
-                <w:szCs w:val="16"/>
-              </w:rPr>
-              <w:t>7</w:t>
-            </w:r>
-            <w:r>
-              <w:rPr>
-                <w:rFonts w:ascii="Verdana" w:hAnsi="Verdana"/>
-                <w:color w:val="000000"/>
-                <w:sz w:val="16"/>
-                <w:szCs w:val="16"/>
-              </w:rPr>
               <w:t xml:space="preserve">  : Copyright (c) 2012 Alex Ogier. All rights reserved. Copyright (c) 2012 The Go Authors. All rights reserved.</w:t>
             </w:r>
           </w:p>
@@ -2518,7 +2554,16 @@
                 <w:sz w:val="16"/>
                 <w:szCs w:val="16"/>
               </w:rPr>
-              <w:t>43</w:t>
+              <w:t>4</w:t>
+            </w:r>
+            <w:r>
+              <w:rPr>
+                <w:rFonts w:ascii="Verdana" w:hAnsi="Verdana"/>
+                <w:color w:val="000000"/>
+                <w:sz w:val="16"/>
+                <w:szCs w:val="16"/>
+              </w:rPr>
+              <w:t>8</w:t>
             </w:r>
             <w:r>
               <w:rPr>
@@ -3239,7 +3284,7 @@
           <w:p>
             <w:pPr>
               <w:rPr>
-                <w:rFonts w:ascii="Verdana" w:hAnsi="Verdana" w:hint="eastAsia"/>
+                <w:rFonts w:ascii="Verdana" w:hAnsi="Verdana"/>
                 <w:color w:val="000000"/>
                 <w:sz w:val="16"/>
                 <w:szCs w:val="16"/>

</xml_diff>